<commit_message>
Writing an Article and daily cartoon update
</commit_message>
<xml_diff>
--- a/Articles/2026/4_Blender_Tips_and_Tricks/8_How_to_Separate_Two_Vertices_Stuck_Together/8 How to Separate Two Vertices Stuck Together.docx
+++ b/Articles/2026/4_Blender_Tips_and_Tricks/8_How_to_Separate_Two_Vertices_Stuck_Together/8 How to Separate Two Vertices Stuck Together.docx
@@ -17,11 +17,23 @@
     </w:p>
     <w:p>
       <w:r>
-        <w:t>Let’s say you accidentally merged these two vertices together. One belongs to the outer rim of the ear, and one belongs to the body. How would you go about fixing this kind of thing.</w:t>
+        <w:t xml:space="preserve">Let’s say you accidentally merged these two vertices together. One belongs to the outer rim of the ear, and one belongs to the body. How would you go about </w:t>
+      </w:r>
+      <w:r>
+        <w:t>separating</w:t>
+      </w:r>
+      <w:r>
+        <w:t xml:space="preserve"> this kind of thing</w:t>
+      </w:r>
+      <w:r>
+        <w:t xml:space="preserve"> in Blender?</w:t>
       </w:r>
     </w:p>
     <w:p>
       <w:r>
+        <w:rPr>
+          <w:noProof/>
+        </w:rPr>
         <w:drawing>
           <wp:inline distT="0" distB="0" distL="0" distR="0" wp14:anchorId="3F3D066E" wp14:editId="35EC019C">
             <wp:extent cx="5943600" cy="5537200"/>
@@ -61,11 +73,20 @@
     </w:p>
     <w:p>
       <w:r>
-        <w:t>Well, Blender has a tool just for this. It is called Rip Region. You can find it on the left hand side of the view port. It is the last little icon</w:t>
+        <w:t>Well, Blender has a tool just for this. It is called Rip Region. You can find it on the left</w:t>
+      </w:r>
+      <w:r>
+        <w:t>-</w:t>
+      </w:r>
+      <w:r>
+        <w:t>hand side of the view port. It is the last little icon</w:t>
       </w:r>
     </w:p>
     <w:p>
       <w:r>
+        <w:rPr>
+          <w:noProof/>
+        </w:rPr>
         <w:lastRenderedPageBreak/>
         <w:drawing>
           <wp:inline distT="0" distB="0" distL="0" distR="0" wp14:anchorId="0413DE19" wp14:editId="23D6F4E1">
@@ -125,6 +146,9 @@
     </w:p>
     <w:p>
       <w:r>
+        <w:rPr>
+          <w:noProof/>
+        </w:rPr>
         <w:drawing>
           <wp:inline distT="0" distB="0" distL="0" distR="0" wp14:anchorId="6A5A1E55" wp14:editId="7BD86D9A">
             <wp:extent cx="3639058" cy="2581635"/>
@@ -179,7 +203,15 @@
     <w:p/>
     <w:p>
       <w:r>
-        <w:t>And Ripppppp… that thing apart.</w:t>
+        <w:t xml:space="preserve">And </w:t>
+      </w:r>
+      <w:proofErr w:type="spellStart"/>
+      <w:r>
+        <w:t>Ripppppp</w:t>
+      </w:r>
+      <w:proofErr w:type="spellEnd"/>
+      <w:r>
+        <w:t>… that thing apart.</w:t>
       </w:r>
     </w:p>
     <w:p>
@@ -189,6 +221,9 @@
     </w:p>
     <w:p>
       <w:r>
+        <w:rPr>
+          <w:noProof/>
+        </w:rPr>
         <w:drawing>
           <wp:inline distT="0" distB="0" distL="0" distR="0" wp14:anchorId="15532FB8" wp14:editId="39AF0957">
             <wp:extent cx="3429000" cy="2626468"/>

</xml_diff>